<commit_message>
feat(loan-document): add AddOnRate placeholder + fix frontend percentage display
- LoanDocumentMergeDataResolver: adds {AddOnRate} (from
  LoanAccount.addOnInterestRate), completing the Disclosure
  Statement's "Interest rate of X% is equivalent to the Add-on rate
  of Y% per month" line alongside the existing InterestRate/
  ContractualRate.
- utils.ts: new formatPercentage() helper (frontend equivalent of
  the backend's), trims the same fixed-3-decimal display bug
  (2.520% -> 2.52%) - applied to LoanDetailPage.tsx's Interest Rate
  stat card, found by the user seeing "2.520%" there.

Co-Authored-By: Claude Sonnet 5 <noreply@anthropic.com>
</commit_message>
<xml_diff>
--- a/app/backend/templates/DISCLOSURE_STATEMENT.docx
+++ b/app/backend/templates/DISCLOSURE_STATEMENT.docx
@@ -3057,88 +3057,135 @@
         </w:rPr>
       </w:pPr>
     </w:p>
+    <w:p>
+      <w:pPr>
+        <w:ind w:firstLine="720"/>
+        <w:rPr>
+          <w:sz w:val="18"/>
+          <w:szCs w:val="18"/>
+        </w:rPr>
+      </w:pPr>
+    </w:p>
     <w:tbl>
       <w:tblPr>
         <w:tblStyle w:val="TableGrid"/>
         <w:tblW w:w="10790" w:type="dxa"/>
+        <w:tblBorders>
+          <w:top w:val="single" w:sz="4" w:space="0" w:color="D9D9D9" w:themeColor="background1" w:themeShade="D9"/>
+          <w:left w:val="single" w:sz="4" w:space="0" w:color="D9D9D9" w:themeColor="background1" w:themeShade="D9"/>
+          <w:bottom w:val="single" w:sz="4" w:space="0" w:color="D9D9D9" w:themeColor="background1" w:themeShade="D9"/>
+          <w:right w:val="single" w:sz="4" w:space="0" w:color="D9D9D9" w:themeColor="background1" w:themeShade="D9"/>
+          <w:insideH w:val="single" w:sz="4" w:space="0" w:color="D9D9D9" w:themeColor="background1" w:themeShade="D9"/>
+          <w:insideV w:val="single" w:sz="4" w:space="0" w:color="D9D9D9" w:themeColor="background1" w:themeShade="D9"/>
+        </w:tblBorders>
         <w:tblLayout w:type="fixed"/>
         <w:tblLook w:val="04A0" w:firstRow="1" w:lastRow="0" w:firstColumn="1" w:lastColumn="0" w:noHBand="0" w:noVBand="1"/>
       </w:tblPr>
       <w:tblGrid>
-        <w:gridCol w:w="872"/>
-        <w:gridCol w:w="1817"/>
-        <w:gridCol w:w="1690"/>
-        <w:gridCol w:w="1428"/>
-        <w:gridCol w:w="1276"/>
+        <w:gridCol w:w="846"/>
+        <w:gridCol w:w="1843"/>
+        <w:gridCol w:w="1701"/>
+        <w:gridCol w:w="1457"/>
+        <w:gridCol w:w="1236"/>
         <w:gridCol w:w="1701"/>
         <w:gridCol w:w="2006"/>
       </w:tblGrid>
       <w:tr>
         <w:tc>
           <w:tcPr>
-            <w:tcW w:w="872" w:type="dxa"/>
-            <w:tcBorders>
-              <w:top w:val="nil"/>
-              <w:left w:val="nil"/>
-              <w:bottom w:val="nil"/>
-              <w:right w:val="nil"/>
-            </w:tcBorders>
-          </w:tcPr>
-          <w:p>
-            <w:pPr>
+            <w:tcW w:w="846" w:type="dxa"/>
+          </w:tcPr>
+          <w:p>
+            <w:pPr>
+              <w:jc w:val="center"/>
+              <w:rPr>
+                <w:b/>
+                <w:bCs/>
+                <w:sz w:val="18"/>
+                <w:szCs w:val="18"/>
+              </w:rPr>
+            </w:pPr>
+          </w:p>
+        </w:tc>
+        <w:tc>
+          <w:tcPr>
+            <w:tcW w:w="1843" w:type="dxa"/>
+          </w:tcPr>
+          <w:p>
+            <w:pPr>
+              <w:jc w:val="right"/>
+              <w:rPr>
+                <w:b/>
+                <w:bCs/>
+                <w:sz w:val="18"/>
+                <w:szCs w:val="18"/>
+              </w:rPr>
+            </w:pPr>
+            <w:r>
               <w:rPr>
                 <w:rFonts w:ascii="Courier New" w:hAnsi="Courier New" w:cs="Courier New"/>
                 <w:sz w:val="18"/>
                 <w:szCs w:val="18"/>
               </w:rPr>
-            </w:pPr>
-          </w:p>
-        </w:tc>
-        <w:tc>
-          <w:tcPr>
-            <w:tcW w:w="1817" w:type="dxa"/>
-            <w:tcBorders>
-              <w:top w:val="nil"/>
-              <w:left w:val="nil"/>
-              <w:bottom w:val="nil"/>
-              <w:right w:val="nil"/>
-            </w:tcBorders>
-          </w:tcPr>
-          <w:p>
-            <w:pPr>
+              <w:t>Totals</w:t>
+            </w:r>
+          </w:p>
+        </w:tc>
+        <w:tc>
+          <w:tcPr>
+            <w:tcW w:w="1701" w:type="dxa"/>
+          </w:tcPr>
+          <w:p>
+            <w:pPr>
+              <w:jc w:val="right"/>
+              <w:rPr>
+                <w:b/>
+                <w:bCs/>
+                <w:sz w:val="18"/>
+                <w:szCs w:val="18"/>
+              </w:rPr>
+            </w:pPr>
+            <w:r>
               <w:rPr>
                 <w:rFonts w:ascii="Courier New" w:hAnsi="Courier New" w:cs="Courier New"/>
                 <w:sz w:val="18"/>
                 <w:szCs w:val="18"/>
               </w:rPr>
-            </w:pPr>
+              <w:t>{</w:t>
+            </w:r>
+            <w:proofErr w:type="spellStart"/>
             <w:r>
               <w:rPr>
                 <w:rFonts w:ascii="Courier New" w:hAnsi="Courier New" w:cs="Courier New"/>
                 <w:sz w:val="18"/>
                 <w:szCs w:val="18"/>
               </w:rPr>
-              <w:t>Totals</w:t>
-            </w:r>
-          </w:p>
-        </w:tc>
-        <w:tc>
-          <w:tcPr>
-            <w:tcW w:w="1690" w:type="dxa"/>
-            <w:tcBorders>
-              <w:top w:val="nil"/>
-              <w:left w:val="nil"/>
-              <w:bottom w:val="nil"/>
-              <w:right w:val="nil"/>
-            </w:tcBorders>
-          </w:tcPr>
-          <w:p>
-            <w:pPr>
+              <w:t>TotalPrincipal</w:t>
+            </w:r>
+            <w:proofErr w:type="spellEnd"/>
+            <w:r>
               <w:rPr>
                 <w:rFonts w:ascii="Courier New" w:hAnsi="Courier New" w:cs="Courier New"/>
                 <w:sz w:val="18"/>
                 <w:szCs w:val="18"/>
               </w:rPr>
+              <w:t>}</w:t>
+            </w:r>
+          </w:p>
+        </w:tc>
+        <w:tc>
+          <w:tcPr>
+            <w:tcW w:w="1457" w:type="dxa"/>
+          </w:tcPr>
+          <w:p>
+            <w:pPr>
+              <w:jc w:val="right"/>
+              <w:rPr>
+                <w:b/>
+                <w:bCs/>
+                <w:sz w:val="18"/>
+                <w:szCs w:val="18"/>
+              </w:rPr>
             </w:pPr>
             <w:r>
               <w:rPr>
@@ -3155,7 +3202,7 @@
                 <w:sz w:val="18"/>
                 <w:szCs w:val="18"/>
               </w:rPr>
-              <w:t>TotalPrincipal</w:t>
+              <w:t>TotalInterest</w:t>
             </w:r>
             <w:proofErr w:type="spellEnd"/>
             <w:r>
@@ -3170,28 +3217,66 @@
         </w:tc>
         <w:tc>
           <w:tcPr>
-            <w:tcW w:w="1428" w:type="dxa"/>
-            <w:tcBorders>
-              <w:top w:val="nil"/>
-              <w:left w:val="nil"/>
-              <w:bottom w:val="nil"/>
-              <w:right w:val="nil"/>
-            </w:tcBorders>
-          </w:tcPr>
-          <w:p>
-            <w:pPr>
+            <w:tcW w:w="1236" w:type="dxa"/>
+          </w:tcPr>
+          <w:p>
+            <w:pPr>
+              <w:jc w:val="right"/>
+              <w:rPr>
+                <w:b/>
+                <w:bCs/>
+                <w:sz w:val="18"/>
+                <w:szCs w:val="18"/>
+              </w:rPr>
+            </w:pPr>
+            <w:r>
               <w:rPr>
                 <w:rFonts w:ascii="Courier New" w:hAnsi="Courier New" w:cs="Courier New"/>
                 <w:sz w:val="18"/>
                 <w:szCs w:val="18"/>
               </w:rPr>
-            </w:pPr>
+              <w:t>{</w:t>
+            </w:r>
+            <w:proofErr w:type="spellStart"/>
             <w:r>
               <w:rPr>
                 <w:rFonts w:ascii="Courier New" w:hAnsi="Courier New" w:cs="Courier New"/>
                 <w:sz w:val="18"/>
                 <w:szCs w:val="18"/>
               </w:rPr>
+              <w:t>TotalFees</w:t>
+            </w:r>
+            <w:proofErr w:type="spellEnd"/>
+            <w:r>
+              <w:rPr>
+                <w:rFonts w:ascii="Courier New" w:hAnsi="Courier New" w:cs="Courier New"/>
+                <w:sz w:val="18"/>
+                <w:szCs w:val="18"/>
+              </w:rPr>
+              <w:t>}</w:t>
+            </w:r>
+          </w:p>
+        </w:tc>
+        <w:tc>
+          <w:tcPr>
+            <w:tcW w:w="1701" w:type="dxa"/>
+          </w:tcPr>
+          <w:p>
+            <w:pPr>
+              <w:jc w:val="right"/>
+              <w:rPr>
+                <w:b/>
+                <w:bCs/>
+                <w:sz w:val="18"/>
+                <w:szCs w:val="18"/>
+              </w:rPr>
+            </w:pPr>
+            <w:r>
+              <w:rPr>
+                <w:rFonts w:ascii="Courier New" w:hAnsi="Courier New" w:cs="Courier New"/>
+                <w:sz w:val="18"/>
+                <w:szCs w:val="18"/>
+              </w:rPr>
               <w:t>{</w:t>
             </w:r>
             <w:proofErr w:type="spellStart"/>
@@ -3201,7 +3286,7 @@
                 <w:sz w:val="18"/>
                 <w:szCs w:val="18"/>
               </w:rPr>
-              <w:t>TotalInterest</w:t>
+              <w:t>TotalPaymentDue</w:t>
             </w:r>
             <w:proofErr w:type="spellEnd"/>
             <w:r>
@@ -3216,112 +3301,130 @@
         </w:tc>
         <w:tc>
           <w:tcPr>
-            <w:tcW w:w="1276" w:type="dxa"/>
-            <w:tcBorders>
-              <w:top w:val="nil"/>
-              <w:left w:val="nil"/>
-              <w:bottom w:val="nil"/>
-              <w:right w:val="nil"/>
-            </w:tcBorders>
-          </w:tcPr>
-          <w:p>
-            <w:pPr>
-              <w:rPr>
-                <w:rFonts w:ascii="Courier New" w:hAnsi="Courier New" w:cs="Courier New"/>
-                <w:sz w:val="18"/>
-                <w:szCs w:val="18"/>
-              </w:rPr>
-            </w:pPr>
-            <w:r>
-              <w:rPr>
-                <w:rFonts w:ascii="Courier New" w:hAnsi="Courier New" w:cs="Courier New"/>
-                <w:sz w:val="18"/>
-                <w:szCs w:val="18"/>
-              </w:rPr>
-              <w:t>{</w:t>
-            </w:r>
-            <w:proofErr w:type="spellStart"/>
-            <w:r>
-              <w:rPr>
-                <w:rFonts w:ascii="Courier New" w:hAnsi="Courier New" w:cs="Courier New"/>
-                <w:sz w:val="18"/>
-                <w:szCs w:val="18"/>
-              </w:rPr>
-              <w:t>TotalFees</w:t>
-            </w:r>
-            <w:proofErr w:type="spellEnd"/>
-            <w:r>
-              <w:rPr>
-                <w:rFonts w:ascii="Courier New" w:hAnsi="Courier New" w:cs="Courier New"/>
-                <w:sz w:val="18"/>
-                <w:szCs w:val="18"/>
-              </w:rPr>
-              <w:t>}</w:t>
-            </w:r>
+            <w:tcW w:w="2006" w:type="dxa"/>
+          </w:tcPr>
+          <w:p>
+            <w:pPr>
+              <w:jc w:val="center"/>
+              <w:rPr>
+                <w:b/>
+                <w:bCs/>
+                <w:sz w:val="18"/>
+                <w:szCs w:val="18"/>
+              </w:rPr>
+            </w:pPr>
+          </w:p>
+        </w:tc>
+      </w:tr>
+      <w:tr>
+        <w:tc>
+          <w:tcPr>
+            <w:tcW w:w="846" w:type="dxa"/>
+            <w:hideMark/>
+          </w:tcPr>
+          <w:p>
+            <w:pPr>
+              <w:rPr>
+                <w:rFonts w:ascii="Segoe UI" w:eastAsia="Times New Roman" w:hAnsi="Segoe UI" w:cs="Segoe UI"/>
+                <w:sz w:val="18"/>
+                <w:szCs w:val="18"/>
+                <w:lang w:val="en-ID"/>
+              </w:rPr>
+            </w:pPr>
+          </w:p>
+        </w:tc>
+        <w:tc>
+          <w:tcPr>
+            <w:tcW w:w="1843" w:type="dxa"/>
+            <w:hideMark/>
+          </w:tcPr>
+          <w:p>
+            <w:pPr>
+              <w:rPr>
+                <w:rFonts w:ascii="Segoe UI" w:eastAsia="Times New Roman" w:hAnsi="Segoe UI" w:cs="Segoe UI"/>
+                <w:sz w:val="18"/>
+                <w:szCs w:val="18"/>
+                <w:lang w:val="en-ID"/>
+              </w:rPr>
+            </w:pPr>
           </w:p>
         </w:tc>
         <w:tc>
           <w:tcPr>
             <w:tcW w:w="1701" w:type="dxa"/>
-            <w:tcBorders>
-              <w:top w:val="nil"/>
-              <w:left w:val="nil"/>
-              <w:bottom w:val="nil"/>
-              <w:right w:val="nil"/>
-            </w:tcBorders>
-          </w:tcPr>
-          <w:p>
-            <w:pPr>
-              <w:rPr>
-                <w:rFonts w:ascii="Courier New" w:hAnsi="Courier New" w:cs="Courier New"/>
-                <w:sz w:val="18"/>
-                <w:szCs w:val="18"/>
-              </w:rPr>
-            </w:pPr>
-            <w:r>
-              <w:rPr>
-                <w:rFonts w:ascii="Courier New" w:hAnsi="Courier New" w:cs="Courier New"/>
-                <w:sz w:val="18"/>
-                <w:szCs w:val="18"/>
-              </w:rPr>
-              <w:t>{</w:t>
-            </w:r>
-            <w:proofErr w:type="spellStart"/>
-            <w:r>
-              <w:rPr>
-                <w:rFonts w:ascii="Courier New" w:hAnsi="Courier New" w:cs="Courier New"/>
-                <w:sz w:val="18"/>
-                <w:szCs w:val="18"/>
-              </w:rPr>
-              <w:t>TotalPaymentDue</w:t>
-            </w:r>
-            <w:proofErr w:type="spellEnd"/>
-            <w:r>
-              <w:rPr>
-                <w:rFonts w:ascii="Courier New" w:hAnsi="Courier New" w:cs="Courier New"/>
-                <w:sz w:val="18"/>
-                <w:szCs w:val="18"/>
-              </w:rPr>
-              <w:t>}</w:t>
-            </w:r>
+            <w:hideMark/>
+          </w:tcPr>
+          <w:p>
+            <w:pPr>
+              <w:rPr>
+                <w:rFonts w:ascii="Segoe UI" w:eastAsia="Times New Roman" w:hAnsi="Segoe UI" w:cs="Segoe UI"/>
+                <w:sz w:val="18"/>
+                <w:szCs w:val="18"/>
+                <w:lang w:val="en-ID"/>
+              </w:rPr>
+            </w:pPr>
+          </w:p>
+        </w:tc>
+        <w:tc>
+          <w:tcPr>
+            <w:tcW w:w="1457" w:type="dxa"/>
+            <w:hideMark/>
+          </w:tcPr>
+          <w:p>
+            <w:pPr>
+              <w:rPr>
+                <w:rFonts w:ascii="Segoe UI" w:eastAsia="Times New Roman" w:hAnsi="Segoe UI" w:cs="Segoe UI"/>
+                <w:sz w:val="18"/>
+                <w:szCs w:val="18"/>
+                <w:lang w:val="en-ID"/>
+              </w:rPr>
+            </w:pPr>
+          </w:p>
+        </w:tc>
+        <w:tc>
+          <w:tcPr>
+            <w:tcW w:w="1236" w:type="dxa"/>
+            <w:hideMark/>
+          </w:tcPr>
+          <w:p>
+            <w:pPr>
+              <w:rPr>
+                <w:rFonts w:ascii="Segoe UI" w:eastAsia="Times New Roman" w:hAnsi="Segoe UI" w:cs="Segoe UI"/>
+                <w:sz w:val="18"/>
+                <w:szCs w:val="18"/>
+                <w:lang w:val="en-ID"/>
+              </w:rPr>
+            </w:pPr>
+          </w:p>
+        </w:tc>
+        <w:tc>
+          <w:tcPr>
+            <w:tcW w:w="1701" w:type="dxa"/>
+            <w:hideMark/>
+          </w:tcPr>
+          <w:p>
+            <w:pPr>
+              <w:rPr>
+                <w:rFonts w:ascii="Segoe UI" w:eastAsia="Times New Roman" w:hAnsi="Segoe UI" w:cs="Segoe UI"/>
+                <w:sz w:val="18"/>
+                <w:szCs w:val="18"/>
+                <w:lang w:val="en-ID"/>
+              </w:rPr>
+            </w:pPr>
           </w:p>
         </w:tc>
         <w:tc>
           <w:tcPr>
             <w:tcW w:w="2006" w:type="dxa"/>
-            <w:tcBorders>
-              <w:top w:val="nil"/>
-              <w:left w:val="nil"/>
-              <w:bottom w:val="nil"/>
-              <w:right w:val="nil"/>
-            </w:tcBorders>
-          </w:tcPr>
-          <w:p>
-            <w:pPr>
-              <w:rPr>
-                <w:rFonts w:ascii="Courier New" w:hAnsi="Courier New" w:cs="Courier New"/>
-                <w:sz w:val="18"/>
-                <w:szCs w:val="18"/>
+            <w:hideMark/>
+          </w:tcPr>
+          <w:p>
+            <w:pPr>
+              <w:rPr>
+                <w:rFonts w:ascii="Segoe UI" w:eastAsia="Times New Roman" w:hAnsi="Segoe UI" w:cs="Segoe UI"/>
+                <w:sz w:val="18"/>
+                <w:szCs w:val="18"/>
+                <w:lang w:val="en-ID"/>
               </w:rPr>
             </w:pPr>
           </w:p>
@@ -3330,7 +3433,16 @@
     </w:tbl>
     <w:p>
       <w:pPr>
-        <w:jc w:val="center"/>
+        <w:ind w:firstLine="720"/>
+        <w:rPr>
+          <w:sz w:val="18"/>
+          <w:szCs w:val="18"/>
+        </w:rPr>
+      </w:pPr>
+    </w:p>
+    <w:p>
+      <w:pPr>
+        <w:ind w:firstLine="720"/>
         <w:rPr>
           <w:sz w:val="18"/>
           <w:szCs w:val="18"/>
@@ -3345,6 +3457,15 @@
           <w:szCs w:val="18"/>
         </w:rPr>
       </w:pPr>
+    </w:p>
+    <w:p>
+      <w:pPr>
+        <w:jc w:val="center"/>
+        <w:rPr>
+          <w:sz w:val="18"/>
+          <w:szCs w:val="18"/>
+        </w:rPr>
+      </w:pPr>
       <w:r>
         <w:rPr>
           <w:sz w:val="18"/>
@@ -3380,7 +3501,7 @@
           <w:sz w:val="18"/>
           <w:szCs w:val="18"/>
         </w:rPr>
-        <w:t>ContractualRate</w:t>
+        <w:t>InterestRate</w:t>
       </w:r>
       <w:proofErr w:type="spellEnd"/>
       <w:r>
@@ -3439,7 +3560,7 @@
           <w:sz w:val="18"/>
           <w:szCs w:val="18"/>
         </w:rPr>
-        <w:t>InterestRate</w:t>
+        <w:t>AddOnRate</w:t>
       </w:r>
       <w:proofErr w:type="spellEnd"/>
       <w:r>
@@ -3922,6 +4043,7 @@
   <w:style w:type="paragraph" w:default="1" w:styleId="Normal">
     <w:name w:val="Normal"/>
     <w:qFormat/>
+    <w:rsid w:val="00B73E8E"/>
   </w:style>
   <w:style w:type="paragraph" w:styleId="Heading1">
     <w:name w:val="heading 1"/>

</xml_diff>

<commit_message>
feat(loan-signing): add centralized E-signature Logs and "Sent OTP to" audit line
Neither the OTP send nor the signing-link send previously left any
persistent record - only ephemeral server logs, and
LoanSigningSession's own otpCodeHash/otpExpiresAt get overwritten on
every resend. Adds a new SigningNotificationLog (one immutable row per
LINK/OTP send, SMS or Email) and a centralized Reports page
(/reports/esignature-logs) to search/filter it across every loan,
rather than adding more density to the Loan Detail page's e-signature
panel.

Also adds a masked "Sent OTP to: <recipient>" line to the audit trail
already stamped on signed documents (Signed by / Date / IP address),
so the document itself carries proof of which channel/recipient the
OTP for that signature went to.

Co-Authored-By: Claude Sonnet 5 <noreply@anthropic.com>
</commit_message>
<xml_diff>
--- a/app/backend/templates/DISCLOSURE_STATEMENT.docx
+++ b/app/backend/templates/DISCLOSURE_STATEMENT.docx
@@ -244,8 +244,9 @@
                 <w:sz w:val="18"/>
                 <w:szCs w:val="18"/>
               </w:rPr>
-              <w:t>{BorrowerName}</w:t>
-            </w:r>
+              <w:t>{</w:t>
+            </w:r>
+            <w:proofErr w:type="spellStart"/>
             <w:r>
               <w:rPr>
                 <w:b/>
@@ -253,8 +254,9 @@
                 <w:sz w:val="18"/>
                 <w:szCs w:val="18"/>
               </w:rPr>
-              <w:br/>
-            </w:r>
+              <w:t>BorrowerName</w:t>
+            </w:r>
+            <w:proofErr w:type="spellEnd"/>
             <w:r>
               <w:rPr>
                 <w:b/>
@@ -262,7 +264,45 @@
                 <w:sz w:val="18"/>
                 <w:szCs w:val="18"/>
               </w:rPr>
-              <w:t>{LoanAccountId}</w:t>
+              <w:t>}</w:t>
+            </w:r>
+            <w:r>
+              <w:rPr>
+                <w:b/>
+                <w:bCs/>
+                <w:sz w:val="18"/>
+                <w:szCs w:val="18"/>
+              </w:rPr>
+              <w:br/>
+            </w:r>
+            <w:r>
+              <w:rPr>
+                <w:b/>
+                <w:bCs/>
+                <w:sz w:val="18"/>
+                <w:szCs w:val="18"/>
+              </w:rPr>
+              <w:t>{</w:t>
+            </w:r>
+            <w:proofErr w:type="spellStart"/>
+            <w:r>
+              <w:rPr>
+                <w:b/>
+                <w:bCs/>
+                <w:sz w:val="18"/>
+                <w:szCs w:val="18"/>
+              </w:rPr>
+              <w:t>LoanAccountId</w:t>
+            </w:r>
+            <w:proofErr w:type="spellEnd"/>
+            <w:r>
+              <w:rPr>
+                <w:b/>
+                <w:bCs/>
+                <w:sz w:val="18"/>
+                <w:szCs w:val="18"/>
+              </w:rPr>
+              <w:t>}</w:t>
             </w:r>
             <w:r>
               <w:rPr>
@@ -393,7 +433,27 @@
                       <w:sz w:val="18"/>
                       <w:szCs w:val="18"/>
                     </w:rPr>
-                    <w:t>{PrincipalAmount}</w:t>
+                    <w:t>{</w:t>
+                  </w:r>
+                  <w:proofErr w:type="spellStart"/>
+                  <w:r>
+                    <w:rPr>
+                      <w:b/>
+                      <w:bCs/>
+                      <w:sz w:val="18"/>
+                      <w:szCs w:val="18"/>
+                    </w:rPr>
+                    <w:t>PrincipalAmount</w:t>
+                  </w:r>
+                  <w:proofErr w:type="spellEnd"/>
+                  <w:r>
+                    <w:rPr>
+                      <w:b/>
+                      <w:bCs/>
+                      <w:sz w:val="18"/>
+                      <w:szCs w:val="18"/>
+                    </w:rPr>
+                    <w:t>}</w:t>
                   </w:r>
                 </w:p>
               </w:tc>
@@ -566,7 +626,39 @@
                       <w:sz w:val="18"/>
                       <w:szCs w:val="18"/>
                     </w:rPr>
-                    <w:t>{ProcessingFee}{/HasProcessingFee}</w:t>
+                    <w:t>{</w:t>
+                  </w:r>
+                  <w:proofErr w:type="spellStart"/>
+                  <w:r>
+                    <w:rPr>
+                      <w:sz w:val="18"/>
+                      <w:szCs w:val="18"/>
+                    </w:rPr>
+                    <w:t>ProcessingFee</w:t>
+                  </w:r>
+                  <w:proofErr w:type="spellEnd"/>
+                  <w:r>
+                    <w:rPr>
+                      <w:sz w:val="18"/>
+                      <w:szCs w:val="18"/>
+                    </w:rPr>
+                    <w:t>}{/</w:t>
+                  </w:r>
+                  <w:proofErr w:type="spellStart"/>
+                  <w:r>
+                    <w:rPr>
+                      <w:sz w:val="18"/>
+                      <w:szCs w:val="18"/>
+                    </w:rPr>
+                    <w:t>HasProcessingFee</w:t>
+                  </w:r>
+                  <w:proofErr w:type="spellEnd"/>
+                  <w:r>
+                    <w:rPr>
+                      <w:sz w:val="18"/>
+                      <w:szCs w:val="18"/>
+                    </w:rPr>
+                    <w:t>}</w:t>
                   </w:r>
                 </w:p>
               </w:tc>
@@ -611,7 +703,39 @@
                       <w:sz w:val="18"/>
                       <w:szCs w:val="18"/>
                     </w:rPr>
-                    <w:t>{AdvanceInterest}{/HasAdvanceInterest}</w:t>
+                    <w:t>{</w:t>
+                  </w:r>
+                  <w:proofErr w:type="spellStart"/>
+                  <w:r>
+                    <w:rPr>
+                      <w:sz w:val="18"/>
+                      <w:szCs w:val="18"/>
+                    </w:rPr>
+                    <w:t>AdvanceInterest</w:t>
+                  </w:r>
+                  <w:proofErr w:type="spellEnd"/>
+                  <w:r>
+                    <w:rPr>
+                      <w:sz w:val="18"/>
+                      <w:szCs w:val="18"/>
+                    </w:rPr>
+                    <w:t>}{/</w:t>
+                  </w:r>
+                  <w:proofErr w:type="spellStart"/>
+                  <w:r>
+                    <w:rPr>
+                      <w:sz w:val="18"/>
+                      <w:szCs w:val="18"/>
+                    </w:rPr>
+                    <w:t>HasAdvanceInterest</w:t>
+                  </w:r>
+                  <w:proofErr w:type="spellEnd"/>
+                  <w:r>
+                    <w:rPr>
+                      <w:sz w:val="18"/>
+                      <w:szCs w:val="18"/>
+                    </w:rPr>
+                    <w:t>}</w:t>
                   </w:r>
                 </w:p>
               </w:tc>
@@ -656,7 +780,39 @@
                       <w:sz w:val="18"/>
                       <w:szCs w:val="18"/>
                     </w:rPr>
-                    <w:t>{AccountManagementFee}{/HasAccountManagementFee}</w:t>
+                    <w:t>{</w:t>
+                  </w:r>
+                  <w:proofErr w:type="spellStart"/>
+                  <w:r>
+                    <w:rPr>
+                      <w:sz w:val="18"/>
+                      <w:szCs w:val="18"/>
+                    </w:rPr>
+                    <w:t>AccountManagementFee</w:t>
+                  </w:r>
+                  <w:proofErr w:type="spellEnd"/>
+                  <w:r>
+                    <w:rPr>
+                      <w:sz w:val="18"/>
+                      <w:szCs w:val="18"/>
+                    </w:rPr>
+                    <w:t>}{/</w:t>
+                  </w:r>
+                  <w:proofErr w:type="spellStart"/>
+                  <w:r>
+                    <w:rPr>
+                      <w:sz w:val="18"/>
+                      <w:szCs w:val="18"/>
+                    </w:rPr>
+                    <w:t>HasAccountManagementFee</w:t>
+                  </w:r>
+                  <w:proofErr w:type="spellEnd"/>
+                  <w:r>
+                    <w:rPr>
+                      <w:sz w:val="18"/>
+                      <w:szCs w:val="18"/>
+                    </w:rPr>
+                    <w:t>}</w:t>
                   </w:r>
                 </w:p>
               </w:tc>
@@ -701,7 +857,39 @@
                       <w:sz w:val="18"/>
                       <w:szCs w:val="18"/>
                     </w:rPr>
-                    <w:t>{MiscellaneousFee}{/HasMiscellaneousFee}</w:t>
+                    <w:t>{</w:t>
+                  </w:r>
+                  <w:proofErr w:type="spellStart"/>
+                  <w:r>
+                    <w:rPr>
+                      <w:sz w:val="18"/>
+                      <w:szCs w:val="18"/>
+                    </w:rPr>
+                    <w:t>MiscellaneousFee</w:t>
+                  </w:r>
+                  <w:proofErr w:type="spellEnd"/>
+                  <w:r>
+                    <w:rPr>
+                      <w:sz w:val="18"/>
+                      <w:szCs w:val="18"/>
+                    </w:rPr>
+                    <w:t>}{/</w:t>
+                  </w:r>
+                  <w:proofErr w:type="spellStart"/>
+                  <w:r>
+                    <w:rPr>
+                      <w:sz w:val="18"/>
+                      <w:szCs w:val="18"/>
+                    </w:rPr>
+                    <w:t>HasMiscellaneousFee</w:t>
+                  </w:r>
+                  <w:proofErr w:type="spellEnd"/>
+                  <w:r>
+                    <w:rPr>
+                      <w:sz w:val="18"/>
+                      <w:szCs w:val="18"/>
+                    </w:rPr>
+                    <w:t>}</w:t>
                   </w:r>
                 </w:p>
               </w:tc>
@@ -746,7 +934,39 @@
                       <w:sz w:val="18"/>
                       <w:szCs w:val="18"/>
                     </w:rPr>
-                    <w:t>{DocStamp}{/HasDocStamp}</w:t>
+                    <w:t>{</w:t>
+                  </w:r>
+                  <w:proofErr w:type="spellStart"/>
+                  <w:r>
+                    <w:rPr>
+                      <w:sz w:val="18"/>
+                      <w:szCs w:val="18"/>
+                    </w:rPr>
+                    <w:t>DocStamp</w:t>
+                  </w:r>
+                  <w:proofErr w:type="spellEnd"/>
+                  <w:r>
+                    <w:rPr>
+                      <w:sz w:val="18"/>
+                      <w:szCs w:val="18"/>
+                    </w:rPr>
+                    <w:t>}{/</w:t>
+                  </w:r>
+                  <w:proofErr w:type="spellStart"/>
+                  <w:r>
+                    <w:rPr>
+                      <w:sz w:val="18"/>
+                      <w:szCs w:val="18"/>
+                    </w:rPr>
+                    <w:t>HasDocStamp</w:t>
+                  </w:r>
+                  <w:proofErr w:type="spellEnd"/>
+                  <w:r>
+                    <w:rPr>
+                      <w:sz w:val="18"/>
+                      <w:szCs w:val="18"/>
+                    </w:rPr>
+                    <w:t>}</w:t>
                   </w:r>
                 </w:p>
               </w:tc>
@@ -791,7 +1011,39 @@
                       <w:sz w:val="18"/>
                       <w:szCs w:val="18"/>
                     </w:rPr>
-                    <w:t>{OutstandingBalance}{/HasOutstandingBalance}</w:t>
+                    <w:t>{</w:t>
+                  </w:r>
+                  <w:proofErr w:type="spellStart"/>
+                  <w:r>
+                    <w:rPr>
+                      <w:sz w:val="18"/>
+                      <w:szCs w:val="18"/>
+                    </w:rPr>
+                    <w:t>OutstandingBalance</w:t>
+                  </w:r>
+                  <w:proofErr w:type="spellEnd"/>
+                  <w:r>
+                    <w:rPr>
+                      <w:sz w:val="18"/>
+                      <w:szCs w:val="18"/>
+                    </w:rPr>
+                    <w:t>}{/</w:t>
+                  </w:r>
+                  <w:proofErr w:type="spellStart"/>
+                  <w:r>
+                    <w:rPr>
+                      <w:sz w:val="18"/>
+                      <w:szCs w:val="18"/>
+                    </w:rPr>
+                    <w:t>HasOutstandingBalance</w:t>
+                  </w:r>
+                  <w:proofErr w:type="spellEnd"/>
+                  <w:r>
+                    <w:rPr>
+                      <w:sz w:val="18"/>
+                      <w:szCs w:val="18"/>
+                    </w:rPr>
+                    <w:t>}</w:t>
                   </w:r>
                 </w:p>
               </w:tc>
@@ -979,7 +1231,27 @@
                       <w:sz w:val="18"/>
                       <w:szCs w:val="18"/>
                     </w:rPr>
-                    <w:t>{NetProceeds}</w:t>
+                    <w:t>{</w:t>
+                  </w:r>
+                  <w:proofErr w:type="spellStart"/>
+                  <w:r>
+                    <w:rPr>
+                      <w:b/>
+                      <w:bCs/>
+                      <w:sz w:val="18"/>
+                      <w:szCs w:val="18"/>
+                    </w:rPr>
+                    <w:t>NetProceeds</w:t>
+                  </w:r>
+                  <w:proofErr w:type="spellEnd"/>
+                  <w:r>
+                    <w:rPr>
+                      <w:b/>
+                      <w:bCs/>
+                      <w:sz w:val="18"/>
+                      <w:szCs w:val="18"/>
+                    </w:rPr>
+                    <w:t>}</w:t>
                   </w:r>
                 </w:p>
               </w:tc>
@@ -1782,7 +2054,23 @@
           <w:sz w:val="18"/>
           <w:szCs w:val="18"/>
         </w:rPr>
-        <w:t xml:space="preserve"> P {NetProceeds} </w:t>
+        <w:t xml:space="preserve"> P {</w:t>
+      </w:r>
+      <w:proofErr w:type="spellStart"/>
+      <w:r>
+        <w:rPr>
+          <w:sz w:val="18"/>
+          <w:szCs w:val="18"/>
+        </w:rPr>
+        <w:t>NetProceeds</w:t>
+      </w:r>
+      <w:proofErr w:type="spellEnd"/>
+      <w:r>
+        <w:rPr>
+          <w:sz w:val="18"/>
+          <w:szCs w:val="18"/>
+        </w:rPr>
+        <w:t xml:space="preserve">} </w:t>
       </w:r>
       <w:r>
         <w:rPr>
@@ -1875,7 +2163,23 @@
                 <w:sz w:val="18"/>
                 <w:szCs w:val="18"/>
               </w:rPr>
-              <w:t>{BorrowerName}</w:t>
+              <w:t>{</w:t>
+            </w:r>
+            <w:proofErr w:type="spellStart"/>
+            <w:r>
+              <w:rPr>
+                <w:sz w:val="18"/>
+                <w:szCs w:val="18"/>
+              </w:rPr>
+              <w:t>BorrowerName</w:t>
+            </w:r>
+            <w:proofErr w:type="spellEnd"/>
+            <w:r>
+              <w:rPr>
+                <w:sz w:val="18"/>
+                <w:szCs w:val="18"/>
+              </w:rPr>
+              <w:t>}</w:t>
             </w:r>
           </w:p>
         </w:tc>
@@ -1909,7 +2213,23 @@
                 <w:sz w:val="18"/>
                 <w:szCs w:val="18"/>
               </w:rPr>
-              <w:t>{CoBorrowerName}</w:t>
+              <w:t>{</w:t>
+            </w:r>
+            <w:proofErr w:type="spellStart"/>
+            <w:r>
+              <w:rPr>
+                <w:sz w:val="18"/>
+                <w:szCs w:val="18"/>
+              </w:rPr>
+              <w:t>CoBorrowerName</w:t>
+            </w:r>
+            <w:proofErr w:type="spellEnd"/>
+            <w:r>
+              <w:rPr>
+                <w:sz w:val="18"/>
+                <w:szCs w:val="18"/>
+              </w:rPr>
+              <w:t>}</w:t>
             </w:r>
           </w:p>
         </w:tc>
@@ -1927,13 +2247,6 @@
                 <w:szCs w:val="18"/>
               </w:rPr>
             </w:pPr>
-            <w:r>
-              <w:rPr>
-                <w:sz w:val="18"/>
-                <w:szCs w:val="18"/>
-              </w:rPr>
-              <w:t>Borrower’s Signature over printed name</w:t>
-            </w:r>
           </w:p>
         </w:tc>
         <w:tc>
@@ -1948,13 +2261,6 @@
                 <w:szCs w:val="18"/>
               </w:rPr>
             </w:pPr>
-            <w:r>
-              <w:rPr>
-                <w:sz w:val="18"/>
-                <w:szCs w:val="18"/>
-              </w:rPr>
-              <w:t>Co-Borrower’s Signature over printed name</w:t>
-            </w:r>
           </w:p>
         </w:tc>
       </w:tr>
@@ -1971,13 +2277,6 @@
                 <w:szCs w:val="18"/>
               </w:rPr>
             </w:pPr>
-            <w:r>
-              <w:rPr>
-                <w:sz w:val="18"/>
-                <w:szCs w:val="18"/>
-              </w:rPr>
-              <w:t>Date:</w:t>
-            </w:r>
           </w:p>
         </w:tc>
         <w:tc>
@@ -1992,13 +2291,6 @@
                 <w:szCs w:val="18"/>
               </w:rPr>
             </w:pPr>
-            <w:r>
-              <w:rPr>
-                <w:sz w:val="18"/>
-                <w:szCs w:val="18"/>
-              </w:rPr>
-              <w:t>Date:</w:t>
-            </w:r>
           </w:p>
         </w:tc>
       </w:tr>
@@ -2507,7 +2799,27 @@
                 <w:szCs w:val="18"/>
                 <w:lang w:val="en-ID"/>
               </w:rPr>
-              <w:t>{PaymentDue}</w:t>
+              <w:t>{</w:t>
+            </w:r>
+            <w:proofErr w:type="spellStart"/>
+            <w:r>
+              <w:rPr>
+                <w:rFonts w:eastAsia="Times New Roman"/>
+                <w:sz w:val="18"/>
+                <w:szCs w:val="18"/>
+                <w:lang w:val="en-ID"/>
+              </w:rPr>
+              <w:t>PaymentDue</w:t>
+            </w:r>
+            <w:proofErr w:type="spellEnd"/>
+            <w:r>
+              <w:rPr>
+                <w:rFonts w:eastAsia="Times New Roman"/>
+                <w:sz w:val="18"/>
+                <w:szCs w:val="18"/>
+                <w:lang w:val="en-ID"/>
+              </w:rPr>
+              <w:t>}</w:t>
             </w:r>
           </w:p>
         </w:tc>
@@ -2535,7 +2847,27 @@
                 <w:szCs w:val="18"/>
                 <w:lang w:val="en-ID"/>
               </w:rPr>
-              <w:t>{Balance}{/AmortizationSchedule}</w:t>
+              <w:t>{Balance}{/</w:t>
+            </w:r>
+            <w:proofErr w:type="spellStart"/>
+            <w:r>
+              <w:rPr>
+                <w:rFonts w:eastAsia="Times New Roman"/>
+                <w:sz w:val="18"/>
+                <w:szCs w:val="18"/>
+                <w:lang w:val="en-ID"/>
+              </w:rPr>
+              <w:t>AmortizationSchedule</w:t>
+            </w:r>
+            <w:proofErr w:type="spellEnd"/>
+            <w:r>
+              <w:rPr>
+                <w:rFonts w:eastAsia="Times New Roman"/>
+                <w:sz w:val="18"/>
+                <w:szCs w:val="18"/>
+                <w:lang w:val="en-ID"/>
+              </w:rPr>
+              <w:t>}</w:t>
             </w:r>
           </w:p>
         </w:tc>
@@ -2642,7 +2974,23 @@
                 <w:sz w:val="18"/>
                 <w:szCs w:val="18"/>
               </w:rPr>
-              <w:t>{TotalPrincipal}</w:t>
+              <w:t>{</w:t>
+            </w:r>
+            <w:proofErr w:type="spellStart"/>
+            <w:r>
+              <w:rPr>
+                <w:sz w:val="18"/>
+                <w:szCs w:val="18"/>
+              </w:rPr>
+              <w:t>TotalPrincipal</w:t>
+            </w:r>
+            <w:proofErr w:type="spellEnd"/>
+            <w:r>
+              <w:rPr>
+                <w:sz w:val="18"/>
+                <w:szCs w:val="18"/>
+              </w:rPr>
+              <w:t>}</w:t>
             </w:r>
           </w:p>
         </w:tc>
@@ -2665,7 +3013,23 @@
                 <w:sz w:val="18"/>
                 <w:szCs w:val="18"/>
               </w:rPr>
-              <w:t>{TotalInterest}</w:t>
+              <w:t>{</w:t>
+            </w:r>
+            <w:proofErr w:type="spellStart"/>
+            <w:r>
+              <w:rPr>
+                <w:sz w:val="18"/>
+                <w:szCs w:val="18"/>
+              </w:rPr>
+              <w:t>TotalInterest</w:t>
+            </w:r>
+            <w:proofErr w:type="spellEnd"/>
+            <w:r>
+              <w:rPr>
+                <w:sz w:val="18"/>
+                <w:szCs w:val="18"/>
+              </w:rPr>
+              <w:t>}</w:t>
             </w:r>
           </w:p>
         </w:tc>
@@ -2688,7 +3052,23 @@
                 <w:sz w:val="18"/>
                 <w:szCs w:val="18"/>
               </w:rPr>
-              <w:t>{TotalFees}</w:t>
+              <w:t>{</w:t>
+            </w:r>
+            <w:proofErr w:type="spellStart"/>
+            <w:r>
+              <w:rPr>
+                <w:sz w:val="18"/>
+                <w:szCs w:val="18"/>
+              </w:rPr>
+              <w:t>TotalFees</w:t>
+            </w:r>
+            <w:proofErr w:type="spellEnd"/>
+            <w:r>
+              <w:rPr>
+                <w:sz w:val="18"/>
+                <w:szCs w:val="18"/>
+              </w:rPr>
+              <w:t>}</w:t>
             </w:r>
           </w:p>
         </w:tc>
@@ -2711,7 +3091,23 @@
                 <w:sz w:val="18"/>
                 <w:szCs w:val="18"/>
               </w:rPr>
-              <w:t>{TotalPaymentDue}</w:t>
+              <w:t>{</w:t>
+            </w:r>
+            <w:proofErr w:type="spellStart"/>
+            <w:r>
+              <w:rPr>
+                <w:sz w:val="18"/>
+                <w:szCs w:val="18"/>
+              </w:rPr>
+              <w:t>TotalPaymentDue</w:t>
+            </w:r>
+            <w:proofErr w:type="spellEnd"/>
+            <w:r>
+              <w:rPr>
+                <w:sz w:val="18"/>
+                <w:szCs w:val="18"/>
+              </w:rPr>
+              <w:t>}</w:t>
             </w:r>
           </w:p>
         </w:tc>
@@ -2901,7 +3297,23 @@
           <w:sz w:val="18"/>
           <w:szCs w:val="18"/>
         </w:rPr>
-        <w:t xml:space="preserve"> {InterestRate}</w:t>
+        <w:t xml:space="preserve"> {</w:t>
+      </w:r>
+      <w:proofErr w:type="spellStart"/>
+      <w:r>
+        <w:rPr>
+          <w:sz w:val="18"/>
+          <w:szCs w:val="18"/>
+        </w:rPr>
+        <w:t>InterestRate</w:t>
+      </w:r>
+      <w:proofErr w:type="spellEnd"/>
+      <w:r>
+        <w:rPr>
+          <w:sz w:val="18"/>
+          <w:szCs w:val="18"/>
+        </w:rPr>
+        <w:t>}</w:t>
       </w:r>
       <w:r>
         <w:rPr>
@@ -2936,7 +3348,23 @@
           <w:sz w:val="18"/>
           <w:szCs w:val="18"/>
         </w:rPr>
-        <w:t>{AddOnRate}</w:t>
+        <w:t>{</w:t>
+      </w:r>
+      <w:proofErr w:type="spellStart"/>
+      <w:r>
+        <w:rPr>
+          <w:sz w:val="18"/>
+          <w:szCs w:val="18"/>
+        </w:rPr>
+        <w:t>AddOnRate</w:t>
+      </w:r>
+      <w:proofErr w:type="spellEnd"/>
+      <w:r>
+        <w:rPr>
+          <w:sz w:val="18"/>
+          <w:szCs w:val="18"/>
+        </w:rPr>
+        <w:t>}</w:t>
       </w:r>
       <w:r>
         <w:rPr>

</xml_diff>